<commit_message>
docs: synchronize tender proposal DOCX with exact real-world project architecture and features
</commit_message>
<xml_diff>
--- a/docs/BMC_Smart_Civic_AI_Proposal_2026.docx
+++ b/docs/BMC_Smart_Civic_AI_Proposal_2026.docx
@@ -24,11 +24,11 @@
           <w:b/>
           <w:bCs/>
           <w:color w:val="0F172A"/>
-          <w:sz w:val="34"/>
-          <w:szCs w:val="34"/>
+          <w:sz w:val="32"/>
+          <w:szCs w:val="32"/>
         </w:rPr>
         <w:t xml:space="preserve">DEPLOYMENT OF SMART CIVIC AI PLATFORM (CITYOS)
-Across 24 Administrative Wards (A to T)</w:t>
+Real-Time Grievance Resolution &amp; Ward Telemetry Across 24 Mumbai Wards (A to T)</w:t>
       </w:r>
     </w:p>
     <w:tbl>
@@ -104,7 +104,7 @@
                 <w:sz w:val="19"/>
                 <w:szCs w:val="19"/>
               </w:rPr>
-              <w:t xml:space="preserve">Brihanmumbai Municipal Corporation (BMC), Fort HQ, Mumbai - 400001</w:t>
+              <w:t xml:space="preserve">Brihanmumbai Municipal Corporation (BMC), Mahapalika Marg, Mumbai - 400001</w:t>
             </w:r>
           </w:p>
         </w:tc>
@@ -137,7 +137,7 @@
                 <w:sz w:val="19"/>
                 <w:szCs w:val="19"/>
               </w:rPr>
-              <w:t xml:space="preserve">Subject Matter:</w:t>
+              <w:t xml:space="preserve">Core Architecture Scope:</w:t>
             </w:r>
           </w:p>
         </w:tc>
@@ -166,7 +166,7 @@
                 <w:sz w:val="19"/>
                 <w:szCs w:val="19"/>
               </w:rPr>
-              <w:t xml:space="preserve">AI Grievance Triage, GPS Geofenced Telemetry, and Ward SLA Governance</w:t>
+              <w:t xml:space="preserve">YOLOv8 Vision Intake, 24-Ward GeoJSON Routing, Ward Broadcast Pool Dispatch, AI Quality Gates &amp; Real-Time WebSockets</w:t>
             </w:r>
           </w:p>
         </w:tc>
@@ -199,7 +199,7 @@
                 <w:sz w:val="19"/>
                 <w:szCs w:val="19"/>
               </w:rPr>
-              <w:t xml:space="preserve">Live Demonstration URL:</w:t>
+              <w:t xml:space="preserve">Live Platform URL:</w:t>
             </w:r>
           </w:p>
         </w:tc>
@@ -316,7 +316,7 @@
           <w:sz w:val="26"/>
           <w:szCs w:val="26"/>
         </w:rPr>
-        <w:t xml:space="preserve">1. Official Header &amp; Executive Briefing</w:t>
+        <w:t xml:space="preserve">1. Executive Summary &amp; Vision Statement</w:t>
       </w:r>
     </w:p>
     <w:tbl>
@@ -371,26 +371,12 @@
                 <w:sz w:val="19"/>
                 <w:szCs w:val="19"/>
               </w:rPr>
-              <w:t xml:space="preserve">Smart Civic AI transforms Mumbai's grievance management from a slow, retrospective ticketing portal into a real-time, AI-orchestrated City Operating System (CityOS). Built with edge YOLOv8 computer vision, Marathi/Hindi Web Audio voice parsing, hardware-level GPS coordinate locking, and SHA-256 chained audit logs, the platform eliminates contractor fraud while ensuring sub-second response times.</w:t>
+              <w:t xml:space="preserve">Smart Civic AI is a high-performance, real-time City Operating System (CityOS) engineered specifically for the Brihanmumbai Municipal Corporation (BMC). It replaces slow, error-prone manual triage with automated computer vision classification (YOLOv8 + NVIDIA NIM), spatial Point-in-Polygon 24-Ward routing, an open Ward Broadcast Pool for field worker task claiming, and strict AI-verified resolution quality gates that prevent fraudulent ticket closure.</w:t>
             </w:r>
           </w:p>
         </w:tc>
       </w:tr>
     </w:tbl>
-    <w:p>
-      <w:pPr>
-        <w:spacing w:after="100" w:before="140"/>
-      </w:pPr>
-      <w:r>
-        <w:rPr>
-          <w:rFonts w:ascii="Calibri" w:cs="Calibri" w:eastAsia="Calibri" w:hAnsi="Calibri"/>
-          <w:color w:val="334155"/>
-          <w:sz w:val="20"/>
-          <w:szCs w:val="20"/>
-        </w:rPr>
-        <w:t xml:space="preserve">This proposal is formally addressed to the Municipal Commissioner, Additional Municipal Commissioners, Chief Information Officer (CIO), and Ward Executive Engineers across all 24 administrative wards (A to T) of the Brihanmumbai Municipal Corporation.</w:t>
-      </w:r>
-    </w:p>
     <w:p>
       <w:pPr>
         <w:spacing w:after="120" w:before="250"/>
@@ -404,7 +390,7 @@
           <w:sz w:val="26"/>
           <w:szCs w:val="26"/>
         </w:rPr>
-        <w:t xml:space="preserve">2. Root-Cause Analysis of Mumbai's Civic Grievance Gaps</w:t>
+        <w:t xml:space="preserve">2. Detailed System Architecture &amp; Implementation</w:t>
       </w:r>
     </w:p>
     <w:p>
@@ -420,16 +406,17 @@
           <w:sz w:val="20"/>
           <w:szCs w:val="20"/>
         </w:rPr>
-        <w:t xml:space="preserve">• Volume &amp; Triage Bottleneck: </w:t>
+        <w:t xml:space="preserve">A. Automated AI Vision Intake &amp; Defect Classification:
+</w:t>
       </w:r>
       <w:r>
         <w:rPr>
           <w:rFonts w:ascii="Calibri" w:cs="Calibri" w:eastAsia="Calibri" w:hAnsi="Calibri"/>
           <w:color w:val="334155"/>
-          <w:sz w:val="20"/>
-          <w:szCs w:val="20"/>
-        </w:rPr>
-        <w:t xml:space="preserve">During peak monsoon surges, complaint volumes rise by 420% exceeding 15,000 daily tickets. Over 68% are spatial duplicates of the same hazard, choking Ward Control Rooms.</w:t>
+          <w:sz w:val="19"/>
+          <w:szCs w:val="19"/>
+        </w:rPr>
+        <w:t xml:space="preserve">Citizens report issues by capturing or uploading photos. The intake engine classifies complaints into municipal categories (Potholes, Solid Waste, Drainage, Street Lighting, Water Supply, Encroachment) with real-time confidence scores and automatic severity grading (Low, Medium, High, Critical).</w:t>
       </w:r>
     </w:p>
     <w:p>
@@ -445,16 +432,17 @@
           <w:sz w:val="20"/>
           <w:szCs w:val="20"/>
         </w:rPr>
-        <w:t xml:space="preserve">• Ghost Repairs &amp; Telemetry Gaps: </w:t>
+        <w:t xml:space="preserve">B. 24-Ward High-Precision Spatial Boundary Routing:
+</w:t>
       </w:r>
       <w:r>
         <w:rPr>
           <w:rFonts w:ascii="Calibri" w:cs="Calibri" w:eastAsia="Calibri" w:hAnsi="Calibri"/>
           <w:color w:val="334155"/>
-          <w:sz w:val="20"/>
-          <w:szCs w:val="20"/>
-        </w:rPr>
-        <w:t xml:space="preserve">Legacy portals permit contractor ticket closures without verified GPS coordinates or real-time camera proof, leading to fraudulent payouts.</w:t>
+          <w:sz w:val="19"/>
+          <w:szCs w:val="19"/>
+        </w:rPr>
+        <w:t xml:space="preserve">Using Ray-Casting Point-in-Polygon (PIP) algorithms over authentic GeoJSON polygon coordinates for all 24 BMC Administrative Wards (Ward A to Ward T), complaints are instantly mapped to the correct municipal ward office and department without manual officer intervention.</w:t>
       </w:r>
     </w:p>
     <w:p>
@@ -470,16 +458,17 @@
           <w:sz w:val="20"/>
           <w:szCs w:val="20"/>
         </w:rPr>
-        <w:t xml:space="preserve">• Static SLA Drift: </w:t>
+        <w:t xml:space="preserve">C. Ward Broadcast Pool &amp; Worker Self-Claim Workflow:
+</w:t>
       </w:r>
       <w:r>
         <w:rPr>
           <w:rFonts w:ascii="Calibri" w:cs="Calibri" w:eastAsia="Calibri" w:hAnsi="Calibri"/>
           <w:color w:val="334155"/>
-          <w:sz w:val="20"/>
-          <w:szCs w:val="20"/>
-        </w:rPr>
-        <w:t xml:space="preserve">Life-threatening hazards (open manholes, pipeline ruptures) share the same static 48-72h SLA as cosmetic defects without dynamic auto-escalation.</w:t>
+          <w:sz w:val="19"/>
+          <w:szCs w:val="19"/>
+        </w:rPr>
+        <w:t xml:space="preserve">Rather than locking complaints to a single worker, open tickets are broadcast to the entire Ward Pool. All officers and field workers assigned to that ward can view open tickets in real time. Any worker can claim a task with a single tap (PUT /api/complaints/:id/accept-task), automatically transitioning status to In Progress, incrementing worker active counts, and notifying citizens and officers instantly.</w:t>
       </w:r>
     </w:p>
     <w:p>
@@ -495,16 +484,95 @@
           <w:sz w:val="20"/>
           <w:szCs w:val="20"/>
         </w:rPr>
-        <w:t xml:space="preserve">• Vernacular &amp; Digital Friction: </w:t>
+        <w:t xml:space="preserve">D. AI-Verified Resolution Quality Gatekeeper (Anti-Fraud):
+</w:t>
       </w:r>
       <w:r>
         <w:rPr>
           <w:rFonts w:ascii="Calibri" w:cs="Calibri" w:eastAsia="Calibri" w:hAnsi="Calibri"/>
           <w:color w:val="334155"/>
+          <w:sz w:val="19"/>
+          <w:szCs w:val="19"/>
+        </w:rPr>
+        <w:t xml:space="preserve">A complaint remains strictly In Progress until an authentic, on-site resolution photo is uploaded. The AI Inspector analyzes pixel variance and re-classifies the scene. If the worker uploads the citizen's original defect photo, a black/obscured photo, or if the defect is still present, the system returns HTTP 422 with a specific rejection reason, requiring genuine on-site repair proof.</w:t>
+      </w:r>
+    </w:p>
+    <w:p>
+      <w:pPr>
+        <w:spacing w:after="80" w:before="60"/>
+      </w:pPr>
+      <w:r>
+        <w:rPr>
+          <w:rFonts w:ascii="Calibri" w:cs="Calibri" w:eastAsia="Calibri" w:hAnsi="Calibri"/>
+          <w:b/>
+          <w:bCs/>
+          <w:color w:val="0F172A"/>
           <w:sz w:val="20"/>
           <w:szCs w:val="20"/>
         </w:rPr>
-        <w:t xml:space="preserve">Lack of native Marathi/Hindi voice intake creates barrier to reporting for transit workers, blue-collar citizens, and senior citizens.</w:t>
+        <w:t xml:space="preserve">E. Zero-Latency WebSocket Telemetry &amp; Real-Time Push:
+</w:t>
+      </w:r>
+      <w:r>
+        <w:rPr>
+          <w:rFonts w:ascii="Calibri" w:cs="Calibri" w:eastAsia="Calibri" w:hAnsi="Calibri"/>
+          <w:color w:val="334155"/>
+          <w:sz w:val="19"/>
+          <w:szCs w:val="19"/>
+        </w:rPr>
+        <w:t xml:space="preserve">Built on native Socket.IO rooms (complaint:&lt;id&gt;, user:&lt;citizenId&gt;, ward:&lt;wardName&gt;), progress steps update in real time with haptic vibrations and animated live telemetry notifications without requiring a page reload.</w:t>
+      </w:r>
+    </w:p>
+    <w:p>
+      <w:pPr>
+        <w:spacing w:after="80" w:before="60"/>
+      </w:pPr>
+      <w:r>
+        <w:rPr>
+          <w:rFonts w:ascii="Calibri" w:cs="Calibri" w:eastAsia="Calibri" w:hAnsi="Calibri"/>
+          <w:b/>
+          <w:bCs/>
+          <w:color w:val="0F172A"/>
+          <w:sz w:val="20"/>
+          <w:szCs w:val="20"/>
+        </w:rPr>
+        <w:t xml:space="preserve">F. Traveling Salesperson Problem (TSP) Shift Route Optimizer:
+</w:t>
+      </w:r>
+      <w:r>
+        <w:rPr>
+          <w:rFonts w:ascii="Calibri" w:cs="Calibri" w:eastAsia="Calibri" w:hAnsi="Calibri"/>
+          <w:color w:val="334155"/>
+          <w:sz w:val="19"/>
+          <w:szCs w:val="19"/>
+        </w:rPr>
+        <w:t xml:space="preserve">Field workers can optimize their daily assigned repairs into the shortest driving circuit across Mumbai wards using Nearest-Neighbor and 2-Opt heuristics, complete with interactive Leaflet TSP route visualization.</w:t>
+      </w:r>
+    </w:p>
+    <w:p>
+      <w:pPr>
+        <w:spacing w:after="80" w:before="60"/>
+      </w:pPr>
+      <w:r>
+        <w:rPr>
+          <w:rFonts w:ascii="Calibri" w:cs="Calibri" w:eastAsia="Calibri" w:hAnsi="Calibri"/>
+          <w:b/>
+          <w:bCs/>
+          <w:color w:val="0F172A"/>
+          <w:sz w:val="20"/>
+          <w:szCs w:val="20"/>
+        </w:rPr>
+        <w:t xml:space="preserve">G. Civic Karma Reward Engine &amp; Gamification:
+</w:t>
+      </w:r>
+      <w:r>
+        <w:rPr>
+          <w:rFonts w:ascii="Calibri" w:cs="Calibri" w:eastAsia="Calibri" w:hAnsi="Calibri"/>
+          <w:color w:val="334155"/>
+          <w:sz w:val="19"/>
+          <w:szCs w:val="19"/>
+        </w:rPr>
+        <w:t xml:space="preserve">Citizens earn +10 Civic Karma points for each verified issue reported, unlocking tiered badges (Citizen Contributor, Active Citizen, Ward Guardian) and redeeming municipal partner discount vouchers.</w:t>
       </w:r>
     </w:p>
     <w:p>
@@ -520,7 +588,7 @@
           <w:sz w:val="26"/>
           <w:szCs w:val="26"/>
         </w:rPr>
-        <w:t xml:space="preserve">3. The Proposed Solution: 4-Tier Unified Role Architecture</w:t>
+        <w:t xml:space="preserve">3. 4-Tier Unified Role Hierarchy &amp; Dashboards</w:t>
       </w:r>
     </w:p>
     <w:tbl>
@@ -542,7 +610,7 @@
       <w:tr>
         <w:tc>
           <w:tcPr>
-            <w:tcW w:type="pct" w:w="30%"/>
+            <w:tcW w:type="pct" w:w="25%"/>
             <w:tcBorders>
               <w:top w:val="single" w:color="CBD5E1" w:sz="1"/>
               <w:left w:val="single" w:color="CBD5E1" w:sz="1"/>
@@ -567,13 +635,13 @@
                 <w:sz w:val="20"/>
                 <w:szCs w:val="20"/>
               </w:rPr>
-              <w:t xml:space="preserve">Administrative Tier</w:t>
-            </w:r>
-          </w:p>
-        </w:tc>
-        <w:tc>
-          <w:tcPr>
-            <w:tcW w:type="pct" w:w="70%"/>
+              <w:t xml:space="preserve">Role / Portal</w:t>
+            </w:r>
+          </w:p>
+        </w:tc>
+        <w:tc>
+          <w:tcPr>
+            <w:tcW w:type="pct" w:w="75%"/>
             <w:tcBorders>
               <w:top w:val="single" w:color="CBD5E1" w:sz="1"/>
               <w:left w:val="single" w:color="CBD5E1" w:sz="1"/>
@@ -598,7 +666,7 @@
                 <w:sz w:val="20"/>
                 <w:szCs w:val="20"/>
               </w:rPr>
-              <w:t xml:space="preserve">Key Operational Capabilities &amp; Controls</w:t>
+              <w:t xml:space="preserve">Key Capabilities &amp; Workflows</w:t>
             </w:r>
           </w:p>
         </w:tc>
@@ -606,7 +674,6 @@
       <w:tr>
         <w:tc>
           <w:tcPr>
-            <w:tcW w:type="pct" w:w="30%"/>
             <w:tcBorders>
               <w:top w:val="single" w:color="CBD5E1" w:sz="1"/>
               <w:left w:val="single" w:color="CBD5E1" w:sz="1"/>
@@ -631,13 +698,12 @@
                 <w:sz w:val="19"/>
                 <w:szCs w:val="19"/>
               </w:rPr>
-              <w:t xml:space="preserve">Tier 1: Citizens &amp; RWAs</w:t>
-            </w:r>
-          </w:p>
-        </w:tc>
-        <w:tc>
-          <w:tcPr>
-            <w:tcW w:type="pct" w:w="70%"/>
+              <w:t xml:space="preserve">1. Citizen</w:t>
+            </w:r>
+          </w:p>
+        </w:tc>
+        <w:tc>
+          <w:tcPr>
             <w:tcBorders>
               <w:top w:val="single" w:color="CBD5E1" w:sz="1"/>
               <w:left w:val="single" w:color="CBD5E1" w:sz="1"/>
@@ -660,7 +726,7 @@
                 <w:sz w:val="19"/>
                 <w:szCs w:val="19"/>
               </w:rPr>
-              <w:t xml:space="preserve">1-click filing, Web Audio Marathi/Hindi/English voice notes, live ticket status timeline, and Civic Karma engagement credits.</w:t>
+              <w:t xml:space="preserve">Quick Snap reporting, Marathi/Hindi/English voice input, live GPS map explorer, real-time ticket tracking timeline with before/after resolution diff slider, and Civic Karma vouchers.</w:t>
             </w:r>
           </w:p>
         </w:tc>
@@ -668,7 +734,6 @@
       <w:tr>
         <w:tc>
           <w:tcPr>
-            <w:tcW w:type="pct" w:w="30%"/>
             <w:tcBorders>
               <w:top w:val="single" w:color="CBD5E1" w:sz="1"/>
               <w:left w:val="single" w:color="CBD5E1" w:sz="1"/>
@@ -693,13 +758,12 @@
                 <w:sz w:val="19"/>
                 <w:szCs w:val="19"/>
               </w:rPr>
-              <w:t xml:space="preserve">Tier 2: Field Contractors</w:t>
-            </w:r>
-          </w:p>
-        </w:tc>
-        <w:tc>
-          <w:tcPr>
-            <w:tcW w:type="pct" w:w="70%"/>
+              <w:t xml:space="preserve">2. Field Worker</w:t>
+            </w:r>
+          </w:p>
+        </w:tc>
+        <w:tc>
+          <w:tcPr>
             <w:tcBorders>
               <w:top w:val="single" w:color="CBD5E1" w:sz="1"/>
               <w:left w:val="single" w:color="CBD5E1" w:sz="1"/>
@@ -722,7 +786,7 @@
                 <w:sz w:val="19"/>
                 <w:szCs w:val="19"/>
               </w:rPr>
-              <w:t xml:space="preserve">Mandatory 50m GPS geofenced task queue, before/after camera locking (zero gallery uploads), offline SQLite sync.</w:t>
+              <w:t xml:space="preserve">Ward Open Pool tab for 1-tap task claiming, My Active Repairs queue, TSP shift route optimization, live turn-by-turn GPS navigation, low-bandwidth image compressor, offline queue sync, and AI-inspected resolution proof submission.</w:t>
             </w:r>
           </w:p>
         </w:tc>
@@ -730,7 +794,6 @@
       <w:tr>
         <w:tc>
           <w:tcPr>
-            <w:tcW w:type="pct" w:w="30%"/>
             <w:tcBorders>
               <w:top w:val="single" w:color="CBD5E1" w:sz="1"/>
               <w:left w:val="single" w:color="CBD5E1" w:sz="1"/>
@@ -755,13 +818,12 @@
                 <w:sz w:val="19"/>
                 <w:szCs w:val="19"/>
               </w:rPr>
-              <w:t xml:space="preserve">Tier 3: Ward Officers</w:t>
-            </w:r>
-          </w:p>
-        </w:tc>
-        <w:tc>
-          <w:tcPr>
-            <w:tcW w:type="pct" w:w="70%"/>
+              <w:t xml:space="preserve">3. Ward Officer</w:t>
+            </w:r>
+          </w:p>
+        </w:tc>
+        <w:tc>
+          <w:tcPr>
             <w:tcBorders>
               <w:top w:val="single" w:color="CBD5E1" w:sz="1"/>
               <w:left w:val="single" w:color="CBD5E1" w:sz="1"/>
@@ -784,7 +846,7 @@
                 <w:sz w:val="19"/>
                 <w:szCs w:val="19"/>
               </w:rPr>
-              <w:t xml:space="preserve">Live SLA countdown radar, contractor scorecards, 1-click MMC Act notices (Section 354, 314, Clause 18.4) with SHA-256 seal.</w:t>
+              <w:t xml:space="preserve">Ward control desk with real-time grievance triage, SLA countdown timers, dynamic department filtering, Monsoon flood radar monitoring, and manual worker dispatch overrides.</w:t>
             </w:r>
           </w:p>
         </w:tc>
@@ -792,7 +854,6 @@
       <w:tr>
         <w:tc>
           <w:tcPr>
-            <w:tcW w:type="pct" w:w="30%"/>
             <w:tcBorders>
               <w:top w:val="single" w:color="CBD5E1" w:sz="1"/>
               <w:left w:val="single" w:color="CBD5E1" w:sz="1"/>
@@ -817,13 +878,12 @@
                 <w:sz w:val="19"/>
                 <w:szCs w:val="19"/>
               </w:rPr>
-              <w:t xml:space="preserve">Tier 4: Commissioners HQ</w:t>
-            </w:r>
-          </w:p>
-        </w:tc>
-        <w:tc>
-          <w:tcPr>
-            <w:tcW w:type="pct" w:w="70%"/>
+              <w:t xml:space="preserve">4. Executive Admin</w:t>
+            </w:r>
+          </w:p>
+        </w:tc>
+        <w:tc>
+          <w:tcPr>
             <w:tcBorders>
               <w:top w:val="single" w:color="CBD5E1" w:sz="1"/>
               <w:left w:val="single" w:color="CBD5E1" w:sz="1"/>
@@ -846,7 +906,7 @@
                 <w:sz w:val="19"/>
                 <w:szCs w:val="19"/>
               </w:rPr>
-              <w:t xml:space="preserve">City-wide GIS heatmaps, 3D hydrological runoff digital twin, green bond CapEx ledger, and automated disaster protocols.</w:t>
+              <w:t xml:space="preserve">City-wide Command Center, 24-Ward GIS heatmaps, interactive Admin Data Studio for SQL/aggregate analytics, contractor scorecards, and tamper-evident audit ledger.</w:t>
             </w:r>
           </w:p>
         </w:tc>
@@ -865,214 +925,7 @@
           <w:sz w:val="26"/>
           <w:szCs w:val="26"/>
         </w:rPr>
-        <w:t xml:space="preserve">4. Sovereign Data Security, Legal Compliance &amp; Audit Trails</w:t>
-      </w:r>
-    </w:p>
-    <w:p>
-      <w:pPr>
-        <w:spacing w:after="80" w:before="60"/>
-      </w:pPr>
-      <w:r>
-        <w:rPr>
-          <w:rFonts w:ascii="Calibri" w:cs="Calibri" w:eastAsia="Calibri" w:hAnsi="Calibri"/>
-          <w:b/>
-          <w:bCs/>
-          <w:color w:val="0F172A"/>
-          <w:sz w:val="20"/>
-          <w:szCs w:val="20"/>
-        </w:rPr>
-        <w:t xml:space="preserve">• DPDPA 2023 Compliance: </w:t>
-      </w:r>
-      <w:r>
-        <w:rPr>
-          <w:rFonts w:ascii="Calibri" w:cs="Calibri" w:eastAsia="Calibri" w:hAnsi="Calibri"/>
-          <w:color w:val="334155"/>
-          <w:sz w:val="20"/>
-          <w:szCs w:val="20"/>
-        </w:rPr>
-        <w:t xml:space="preserve">Strict data minimization, ephemeral telemetry storage, and citizen PII hashing (+91 98****1234).</w:t>
-      </w:r>
-    </w:p>
-    <w:p>
-      <w:pPr>
-        <w:spacing w:after="80" w:before="60"/>
-      </w:pPr>
-      <w:r>
-        <w:rPr>
-          <w:rFonts w:ascii="Calibri" w:cs="Calibri" w:eastAsia="Calibri" w:hAnsi="Calibri"/>
-          <w:b/>
-          <w:bCs/>
-          <w:color w:val="0F172A"/>
-          <w:sz w:val="20"/>
-          <w:szCs w:val="20"/>
-        </w:rPr>
-        <w:t xml:space="preserve">• MeitY Empanelled Cloud: </w:t>
-      </w:r>
-      <w:r>
-        <w:rPr>
-          <w:rFonts w:ascii="Calibri" w:cs="Calibri" w:eastAsia="Calibri" w:hAnsi="Calibri"/>
-          <w:color w:val="334155"/>
-          <w:sz w:val="20"/>
-          <w:szCs w:val="20"/>
-        </w:rPr>
-        <w:t xml:space="preserve">100% Indian data sovereignty (AWS Mumbai ap-south-1 / NIC Cloud) with AES-256-GCM rest and TLS 1.3 transit encryption.</w:t>
-      </w:r>
-    </w:p>
-    <w:p>
-      <w:pPr>
-        <w:spacing w:after="80" w:before="60"/>
-      </w:pPr>
-      <w:r>
-        <w:rPr>
-          <w:rFonts w:ascii="Calibri" w:cs="Calibri" w:eastAsia="Calibri" w:hAnsi="Calibri"/>
-          <w:b/>
-          <w:bCs/>
-          <w:color w:val="0F172A"/>
-          <w:sz w:val="20"/>
-          <w:szCs w:val="20"/>
-        </w:rPr>
-        <w:t xml:space="preserve">• SHA-256 Audit Trail: </w:t>
-      </w:r>
-      <w:r>
-        <w:rPr>
-          <w:rFonts w:ascii="Calibri" w:cs="Calibri" w:eastAsia="Calibri" w:hAnsi="Calibri"/>
-          <w:color w:val="334155"/>
-          <w:sz w:val="20"/>
-          <w:szCs w:val="20"/>
-        </w:rPr>
-        <w:t xml:space="preserve">Cryptographically sealed ledger for every ticket action, providing tamper-proof evidence for RTI Act and CAG state audits.</w:t>
-      </w:r>
-    </w:p>
-    <w:p>
-      <w:pPr>
-        <w:spacing w:after="80" w:before="60"/>
-      </w:pPr>
-      <w:r>
-        <w:rPr>
-          <w:rFonts w:ascii="Calibri" w:cs="Calibri" w:eastAsia="Calibri" w:hAnsi="Calibri"/>
-          <w:b/>
-          <w:bCs/>
-          <w:color w:val="0F172A"/>
-          <w:sz w:val="20"/>
-          <w:szCs w:val="20"/>
-        </w:rPr>
-        <w:t xml:space="preserve">• Zero-Trust RBAC: </w:t>
-      </w:r>
-      <w:r>
-        <w:rPr>
-          <w:rFonts w:ascii="Calibri" w:cs="Calibri" w:eastAsia="Calibri" w:hAnsi="Calibri"/>
-          <w:color w:val="334155"/>
-          <w:sz w:val="20"/>
-          <w:szCs w:val="20"/>
-        </w:rPr>
-        <w:t xml:space="preserve">100% pass rate across 30 automated security penetration vectors (BOLA, NoSQL injection, DDoS throttling).</w:t>
-      </w:r>
-    </w:p>
-    <w:p>
-      <w:pPr>
-        <w:spacing w:after="120" w:before="250"/>
-      </w:pPr>
-      <w:r>
-        <w:rPr>
-          <w:rFonts w:ascii="Calibri" w:cs="Calibri" w:eastAsia="Calibri" w:hAnsi="Calibri"/>
-          <w:b/>
-          <w:bCs/>
-          <w:color w:val="0369A1"/>
-          <w:sz w:val="26"/>
-          <w:szCs w:val="26"/>
-        </w:rPr>
-        <w:t xml:space="preserve">5. Interoperability &amp; Disaster Recovery Protocol</w:t>
-      </w:r>
-    </w:p>
-    <w:p>
-      <w:pPr>
-        <w:spacing w:after="80" w:before="60"/>
-      </w:pPr>
-      <w:r>
-        <w:rPr>
-          <w:rFonts w:ascii="Calibri" w:cs="Calibri" w:eastAsia="Calibri" w:hAnsi="Calibri"/>
-          <w:b/>
-          <w:bCs/>
-          <w:color w:val="0F172A"/>
-          <w:sz w:val="20"/>
-          <w:szCs w:val="20"/>
-        </w:rPr>
-        <w:t xml:space="preserve">• BMC SAP / MCGS Sync: </w:t>
-      </w:r>
-      <w:r>
-        <w:rPr>
-          <w:rFonts w:ascii="Calibri" w:cs="Calibri" w:eastAsia="Calibri" w:hAnsi="Calibri"/>
-          <w:color w:val="334155"/>
-          <w:sz w:val="20"/>
-          <w:szCs w:val="20"/>
-        </w:rPr>
-        <w:t xml:space="preserve">Bidirectional RESTful webhook adapters allow parallel dual-run mode without disrupting existing enterprise investments.</w:t>
-      </w:r>
-    </w:p>
-    <w:p>
-      <w:pPr>
-        <w:spacing w:after="80" w:before="60"/>
-      </w:pPr>
-      <w:r>
-        <w:rPr>
-          <w:rFonts w:ascii="Calibri" w:cs="Calibri" w:eastAsia="Calibri" w:hAnsi="Calibri"/>
-          <w:b/>
-          <w:bCs/>
-          <w:color w:val="0F172A"/>
-          <w:sz w:val="20"/>
-          <w:szCs w:val="20"/>
-        </w:rPr>
-        <w:t xml:space="preserve">• 60-Second Instant Rollback: </w:t>
-      </w:r>
-      <w:r>
-        <w:rPr>
-          <w:rFonts w:ascii="Calibri" w:cs="Calibri" w:eastAsia="Calibri" w:hAnsi="Calibri"/>
-          <w:color w:val="334155"/>
-          <w:sz w:val="20"/>
-          <w:szCs w:val="20"/>
-        </w:rPr>
-        <w:t xml:space="preserve">Containerized immutable deployments allow instant blue/green traffic cutover to prior certified baselines in case of systemic failure.</w:t>
-      </w:r>
-    </w:p>
-    <w:p>
-      <w:pPr>
-        <w:spacing w:after="80" w:before="60"/>
-      </w:pPr>
-      <w:r>
-        <w:rPr>
-          <w:rFonts w:ascii="Calibri" w:cs="Calibri" w:eastAsia="Calibri" w:hAnsi="Calibri"/>
-          <w:b/>
-          <w:bCs/>
-          <w:color w:val="0F172A"/>
-          <w:sz w:val="20"/>
-          <w:szCs w:val="20"/>
-        </w:rPr>
-        <w:t xml:space="preserve">• High Availability &amp; PITR: </w:t>
-      </w:r>
-      <w:r>
-        <w:rPr>
-          <w:rFonts w:ascii="Calibri" w:cs="Calibri" w:eastAsia="Calibri" w:hAnsi="Calibri"/>
-          <w:color w:val="334155"/>
-          <w:sz w:val="20"/>
-          <w:szCs w:val="20"/>
-        </w:rPr>
-        <w:t xml:space="preserve">99.99% uptime SLA with continuous replica-set backups (RPO &lt; 1s, RTO &lt; 15min) and Redis Dead-Letter Queues for failed background jobs.</w:t>
-      </w:r>
-    </w:p>
-    <w:p>
-      <w:pPr>
-        <w:spacing w:after="120" w:before="250"/>
-      </w:pPr>
-      <w:r>
-        <w:rPr>
-          <w:rFonts w:ascii="Calibri" w:cs="Calibri" w:eastAsia="Calibri" w:hAnsi="Calibri"/>
-          <w:b/>
-          <w:bCs/>
-          <w:color w:val="0369A1"/>
-          <w:sz w:val="26"/>
-          <w:szCs w:val="26"/>
-        </w:rPr>
-        <w:t xml:space="preserve">6. Projected Annual ROI &amp; Fiscal Benefits</w:t>
+        <w:t xml:space="preserve">4. Technology Stack &amp; Enterprise Resilience</w:t>
       </w:r>
     </w:p>
     <w:tbl>
@@ -1094,7 +947,7 @@
       <w:tr>
         <w:tc>
           <w:tcPr>
-            <w:tcW w:type="pct" w:w="65%"/>
+            <w:tcW w:type="pct" w:w="30%"/>
             <w:tcBorders>
               <w:top w:val="single" w:color="CBD5E1" w:sz="1"/>
               <w:left w:val="single" w:color="CBD5E1" w:sz="1"/>
@@ -1102,69 +955,6 @@
               <w:right w:val="single" w:color="CBD5E1" w:sz="1"/>
             </w:tcBorders>
             <w:shd w:fill="0F766E" w:val="clear"/>
-            <w:tcMar>
-              <w:top w:type="dxa" w:w="120"/>
-              <w:left w:type="dxa" w:w="140"/>
-              <w:bottom w:type="dxa" w:w="120"/>
-              <w:right w:type="dxa" w:w="140"/>
-            </w:tcMar>
-          </w:tcPr>
-          <w:p>
-            <w:r>
-              <w:rPr>
-                <w:rFonts w:ascii="Calibri" w:cs="Calibri" w:eastAsia="Calibri" w:hAnsi="Calibri"/>
-                <w:b/>
-                <w:bCs/>
-                <w:color w:val="FFFFFF"/>
-                <w:sz w:val="20"/>
-                <w:szCs w:val="20"/>
-              </w:rPr>
-              <w:t xml:space="preserve">Optimization Stream</w:t>
-            </w:r>
-          </w:p>
-        </w:tc>
-        <w:tc>
-          <w:tcPr>
-            <w:tcW w:type="pct" w:w="35%"/>
-            <w:tcBorders>
-              <w:top w:val="single" w:color="CBD5E1" w:sz="1"/>
-              <w:left w:val="single" w:color="CBD5E1" w:sz="1"/>
-              <w:bottom w:val="single" w:color="CBD5E1" w:sz="1"/>
-              <w:right w:val="single" w:color="CBD5E1" w:sz="1"/>
-            </w:tcBorders>
-            <w:shd w:fill="0F766E" w:val="clear"/>
-            <w:tcMar>
-              <w:top w:type="dxa" w:w="120"/>
-              <w:left w:type="dxa" w:w="140"/>
-              <w:bottom w:type="dxa" w:w="120"/>
-              <w:right w:type="dxa" w:w="140"/>
-            </w:tcMar>
-          </w:tcPr>
-          <w:p>
-            <w:r>
-              <w:rPr>
-                <w:rFonts w:ascii="Calibri" w:cs="Calibri" w:eastAsia="Calibri" w:hAnsi="Calibri"/>
-                <w:b/>
-                <w:bCs/>
-                <w:color w:val="FFFFFF"/>
-                <w:sz w:val="20"/>
-                <w:szCs w:val="20"/>
-              </w:rPr>
-              <w:t xml:space="preserve">Annual Savings</w:t>
-            </w:r>
-          </w:p>
-        </w:tc>
-      </w:tr>
-      <w:tr>
-        <w:tc>
-          <w:tcPr>
-            <w:tcBorders>
-              <w:top w:val="single" w:color="CBD5E1" w:sz="1"/>
-              <w:left w:val="single" w:color="CBD5E1" w:sz="1"/>
-              <w:bottom w:val="single" w:color="CBD5E1" w:sz="1"/>
-              <w:right w:val="single" w:color="CBD5E1" w:sz="1"/>
-            </w:tcBorders>
-            <w:shd w:fill="F8FAFC" w:val="clear"/>
             <w:tcMar>
               <w:top w:type="dxa" w:w="100"/>
               <w:left w:type="dxa" w:w="140"/>
@@ -1176,23 +966,26 @@
             <w:r>
               <w:rPr>
                 <w:rFonts w:ascii="Calibri" w:cs="Calibri" w:eastAsia="Calibri" w:hAnsi="Calibri"/>
-                <w:color w:val="334155"/>
-                <w:sz w:val="19"/>
-                <w:szCs w:val="19"/>
-              </w:rPr>
-              <w:t xml:space="preserve">Elimination of Fraudulent Contractor Claims (50m Geofence Lock)</w:t>
-            </w:r>
-          </w:p>
-        </w:tc>
-        <w:tc>
-          <w:tcPr>
-            <w:tcBorders>
-              <w:top w:val="single" w:color="CBD5E1" w:sz="1"/>
-              <w:left w:val="single" w:color="CBD5E1" w:sz="1"/>
-              <w:bottom w:val="single" w:color="CBD5E1" w:sz="1"/>
-              <w:right w:val="single" w:color="CBD5E1" w:sz="1"/>
-            </w:tcBorders>
-            <w:shd w:fill="F8FAFC" w:val="clear"/>
+                <w:b/>
+                <w:bCs/>
+                <w:color w:val="FFFFFF"/>
+                <w:sz w:val="20"/>
+                <w:szCs w:val="20"/>
+              </w:rPr>
+              <w:t xml:space="preserve">Layer</w:t>
+            </w:r>
+          </w:p>
+        </w:tc>
+        <w:tc>
+          <w:tcPr>
+            <w:tcW w:type="pct" w:w="70%"/>
+            <w:tcBorders>
+              <w:top w:val="single" w:color="CBD5E1" w:sz="1"/>
+              <w:left w:val="single" w:color="CBD5E1" w:sz="1"/>
+              <w:bottom w:val="single" w:color="CBD5E1" w:sz="1"/>
+              <w:right w:val="single" w:color="CBD5E1" w:sz="1"/>
+            </w:tcBorders>
+            <w:shd w:fill="0F766E" w:val="clear"/>
             <w:tcMar>
               <w:top w:type="dxa" w:w="100"/>
               <w:left w:type="dxa" w:w="140"/>
@@ -1206,11 +999,11 @@
                 <w:rFonts w:ascii="Calibri" w:cs="Calibri" w:eastAsia="Calibri" w:hAnsi="Calibri"/>
                 <w:b/>
                 <w:bCs/>
-                <w:color w:val="0F172A"/>
-                <w:sz w:val="19"/>
-                <w:szCs w:val="19"/>
-              </w:rPr>
-              <w:t xml:space="preserve">₹ 24.50 Crore</w:t>
+                <w:color w:val="FFFFFF"/>
+                <w:sz w:val="20"/>
+                <w:szCs w:val="20"/>
+              </w:rPr>
+              <w:t xml:space="preserve">Implemented Technology &amp; Framework</w:t>
             </w:r>
           </w:p>
         </w:tc>
@@ -1224,53 +1017,49 @@
               <w:bottom w:val="single" w:color="CBD5E1" w:sz="1"/>
               <w:right w:val="single" w:color="CBD5E1" w:sz="1"/>
             </w:tcBorders>
-            <w:shd w:fill="FFFFFF" w:val="clear"/>
-            <w:tcMar>
-              <w:top w:type="dxa" w:w="100"/>
-              <w:left w:type="dxa" w:w="140"/>
-              <w:bottom w:type="dxa" w:w="100"/>
-              <w:right w:type="dxa" w:w="140"/>
-            </w:tcMar>
-          </w:tcPr>
-          <w:p>
-            <w:r>
-              <w:rPr>
-                <w:rFonts w:ascii="Calibri" w:cs="Calibri" w:eastAsia="Calibri" w:hAnsi="Calibri"/>
-                <w:color w:val="334155"/>
-                <w:sz w:val="19"/>
-                <w:szCs w:val="19"/>
-              </w:rPr>
-              <w:t xml:space="preserve">Ward Control Room Man-Hour Savings (187,000 Hours Saved)</w:t>
-            </w:r>
-          </w:p>
-        </w:tc>
-        <w:tc>
-          <w:tcPr>
-            <w:tcBorders>
-              <w:top w:val="single" w:color="CBD5E1" w:sz="1"/>
-              <w:left w:val="single" w:color="CBD5E1" w:sz="1"/>
-              <w:bottom w:val="single" w:color="CBD5E1" w:sz="1"/>
-              <w:right w:val="single" w:color="CBD5E1" w:sz="1"/>
-            </w:tcBorders>
-            <w:shd w:fill="FFFFFF" w:val="clear"/>
-            <w:tcMar>
-              <w:top w:type="dxa" w:w="100"/>
-              <w:left w:type="dxa" w:w="140"/>
-              <w:bottom w:type="dxa" w:w="100"/>
-              <w:right w:type="dxa" w:w="140"/>
-            </w:tcMar>
-          </w:tcPr>
-          <w:p>
-            <w:r>
-              <w:rPr>
-                <w:rFonts w:ascii="Calibri" w:cs="Calibri" w:eastAsia="Calibri" w:hAnsi="Calibri"/>
-                <w:b/>
-                <w:bCs/>
-                <w:color w:val="0F172A"/>
-                <w:sz w:val="19"/>
-                <w:szCs w:val="19"/>
-              </w:rPr>
-              <w:t xml:space="preserve">₹ 9.80 Crore</w:t>
+            <w:tcMar>
+              <w:top w:type="dxa" w:w="80"/>
+              <w:left w:type="dxa" w:w="120"/>
+              <w:bottom w:type="dxa" w:w="80"/>
+              <w:right w:type="dxa" w:w="120"/>
+            </w:tcMar>
+          </w:tcPr>
+          <w:p>
+            <w:r>
+              <w:rPr>
+                <w:rFonts w:ascii="Calibri" w:cs="Calibri" w:eastAsia="Calibri" w:hAnsi="Calibri"/>
+                <w:b/>
+                <w:bCs/>
+                <w:sz w:val="19"/>
+                <w:szCs w:val="19"/>
+              </w:rPr>
+              <w:t xml:space="preserve">Frontend UI</w:t>
+            </w:r>
+          </w:p>
+        </w:tc>
+        <w:tc>
+          <w:tcPr>
+            <w:tcBorders>
+              <w:top w:val="single" w:color="CBD5E1" w:sz="1"/>
+              <w:left w:val="single" w:color="CBD5E1" w:sz="1"/>
+              <w:bottom w:val="single" w:color="CBD5E1" w:sz="1"/>
+              <w:right w:val="single" w:color="CBD5E1" w:sz="1"/>
+            </w:tcBorders>
+            <w:tcMar>
+              <w:top w:type="dxa" w:w="80"/>
+              <w:left w:type="dxa" w:w="120"/>
+              <w:bottom w:type="dxa" w:w="80"/>
+              <w:right w:type="dxa" w:w="120"/>
+            </w:tcMar>
+          </w:tcPr>
+          <w:p>
+            <w:r>
+              <w:rPr>
+                <w:rFonts w:ascii="Calibri" w:cs="Calibri" w:eastAsia="Calibri" w:hAnsi="Calibri"/>
+                <w:sz w:val="19"/>
+                <w:szCs w:val="19"/>
+              </w:rPr>
+              <w:t xml:space="preserve">React 19, TypeScript, Vite, Tailwind CSS, Framer Motion, Lucide Icons, PWA Service Worker</w:t>
             </w:r>
           </w:p>
         </w:tc>
@@ -1284,53 +1073,49 @@
               <w:bottom w:val="single" w:color="CBD5E1" w:sz="1"/>
               <w:right w:val="single" w:color="CBD5E1" w:sz="1"/>
             </w:tcBorders>
-            <w:shd w:fill="F8FAFC" w:val="clear"/>
-            <w:tcMar>
-              <w:top w:type="dxa" w:w="100"/>
-              <w:left w:type="dxa" w:w="140"/>
-              <w:bottom w:type="dxa" w:w="100"/>
-              <w:right w:type="dxa" w:w="140"/>
-            </w:tcMar>
-          </w:tcPr>
-          <w:p>
-            <w:r>
-              <w:rPr>
-                <w:rFonts w:ascii="Calibri" w:cs="Calibri" w:eastAsia="Calibri" w:hAnsi="Calibri"/>
-                <w:color w:val="334155"/>
-                <w:sz w:val="19"/>
-                <w:szCs w:val="19"/>
-              </w:rPr>
-              <w:t xml:space="preserve">Automated Sub-Meter GIS Asset Routing (Fuel/Logistics)</w:t>
-            </w:r>
-          </w:p>
-        </w:tc>
-        <w:tc>
-          <w:tcPr>
-            <w:tcBorders>
-              <w:top w:val="single" w:color="CBD5E1" w:sz="1"/>
-              <w:left w:val="single" w:color="CBD5E1" w:sz="1"/>
-              <w:bottom w:val="single" w:color="CBD5E1" w:sz="1"/>
-              <w:right w:val="single" w:color="CBD5E1" w:sz="1"/>
-            </w:tcBorders>
-            <w:shd w:fill="F8FAFC" w:val="clear"/>
-            <w:tcMar>
-              <w:top w:type="dxa" w:w="100"/>
-              <w:left w:type="dxa" w:w="140"/>
-              <w:bottom w:type="dxa" w:w="100"/>
-              <w:right w:type="dxa" w:w="140"/>
-            </w:tcMar>
-          </w:tcPr>
-          <w:p>
-            <w:r>
-              <w:rPr>
-                <w:rFonts w:ascii="Calibri" w:cs="Calibri" w:eastAsia="Calibri" w:hAnsi="Calibri"/>
-                <w:b/>
-                <w:bCs/>
-                <w:color w:val="0F172A"/>
-                <w:sz w:val="19"/>
-                <w:szCs w:val="19"/>
-              </w:rPr>
-              <w:t xml:space="preserve">₹ 3.20 Crore</w:t>
+            <w:tcMar>
+              <w:top w:type="dxa" w:w="80"/>
+              <w:left w:type="dxa" w:w="120"/>
+              <w:bottom w:type="dxa" w:w="80"/>
+              <w:right w:type="dxa" w:w="120"/>
+            </w:tcMar>
+          </w:tcPr>
+          <w:p>
+            <w:r>
+              <w:rPr>
+                <w:rFonts w:ascii="Calibri" w:cs="Calibri" w:eastAsia="Calibri" w:hAnsi="Calibri"/>
+                <w:b/>
+                <w:bCs/>
+                <w:sz w:val="19"/>
+                <w:szCs w:val="19"/>
+              </w:rPr>
+              <w:t xml:space="preserve">Backend API</w:t>
+            </w:r>
+          </w:p>
+        </w:tc>
+        <w:tc>
+          <w:tcPr>
+            <w:tcBorders>
+              <w:top w:val="single" w:color="CBD5E1" w:sz="1"/>
+              <w:left w:val="single" w:color="CBD5E1" w:sz="1"/>
+              <w:bottom w:val="single" w:color="CBD5E1" w:sz="1"/>
+              <w:right w:val="single" w:color="CBD5E1" w:sz="1"/>
+            </w:tcBorders>
+            <w:tcMar>
+              <w:top w:type="dxa" w:w="80"/>
+              <w:left w:type="dxa" w:w="120"/>
+              <w:bottom w:type="dxa" w:w="80"/>
+              <w:right w:type="dxa" w:w="120"/>
+            </w:tcMar>
+          </w:tcPr>
+          <w:p>
+            <w:r>
+              <w:rPr>
+                <w:rFonts w:ascii="Calibri" w:cs="Calibri" w:eastAsia="Calibri" w:hAnsi="Calibri"/>
+                <w:sz w:val="19"/>
+                <w:szCs w:val="19"/>
+              </w:rPr>
+              <w:t xml:space="preserve">Node.js, Express, Socket.IO, Helmet, Express-Rate-Limit, Compression, Morgan</w:t>
             </w:r>
           </w:p>
         </w:tc>
@@ -1344,53 +1129,49 @@
               <w:bottom w:val="single" w:color="CBD5E1" w:sz="1"/>
               <w:right w:val="single" w:color="CBD5E1" w:sz="1"/>
             </w:tcBorders>
-            <w:shd w:fill="FFFFFF" w:val="clear"/>
-            <w:tcMar>
-              <w:top w:type="dxa" w:w="100"/>
-              <w:left w:type="dxa" w:w="140"/>
-              <w:bottom w:type="dxa" w:w="100"/>
-              <w:right w:type="dxa" w:w="140"/>
-            </w:tcMar>
-          </w:tcPr>
-          <w:p>
-            <w:r>
-              <w:rPr>
-                <w:rFonts w:ascii="Calibri" w:cs="Calibri" w:eastAsia="Calibri" w:hAnsi="Calibri"/>
-                <w:color w:val="334155"/>
-                <w:sz w:val="19"/>
-                <w:szCs w:val="19"/>
-              </w:rPr>
-              <w:t xml:space="preserve">Paperless MMC Act Legal Notices &amp; Automated Compliance</w:t>
-            </w:r>
-          </w:p>
-        </w:tc>
-        <w:tc>
-          <w:tcPr>
-            <w:tcBorders>
-              <w:top w:val="single" w:color="CBD5E1" w:sz="1"/>
-              <w:left w:val="single" w:color="CBD5E1" w:sz="1"/>
-              <w:bottom w:val="single" w:color="CBD5E1" w:sz="1"/>
-              <w:right w:val="single" w:color="CBD5E1" w:sz="1"/>
-            </w:tcBorders>
-            <w:shd w:fill="FFFFFF" w:val="clear"/>
-            <w:tcMar>
-              <w:top w:type="dxa" w:w="100"/>
-              <w:left w:type="dxa" w:w="140"/>
-              <w:bottom w:type="dxa" w:w="100"/>
-              <w:right w:type="dxa" w:w="140"/>
-            </w:tcMar>
-          </w:tcPr>
-          <w:p>
-            <w:r>
-              <w:rPr>
-                <w:rFonts w:ascii="Calibri" w:cs="Calibri" w:eastAsia="Calibri" w:hAnsi="Calibri"/>
-                <w:b/>
-                <w:bCs/>
-                <w:color w:val="0F172A"/>
-                <w:sz w:val="19"/>
-                <w:szCs w:val="19"/>
-              </w:rPr>
-              <w:t xml:space="preserve">₹ 2.30 Crore</w:t>
+            <w:tcMar>
+              <w:top w:type="dxa" w:w="80"/>
+              <w:left w:type="dxa" w:w="120"/>
+              <w:bottom w:type="dxa" w:w="80"/>
+              <w:right w:type="dxa" w:w="120"/>
+            </w:tcMar>
+          </w:tcPr>
+          <w:p>
+            <w:r>
+              <w:rPr>
+                <w:rFonts w:ascii="Calibri" w:cs="Calibri" w:eastAsia="Calibri" w:hAnsi="Calibri"/>
+                <w:b/>
+                <w:bCs/>
+                <w:sz w:val="19"/>
+                <w:szCs w:val="19"/>
+              </w:rPr>
+              <w:t xml:space="preserve">Database &amp; Storage</w:t>
+            </w:r>
+          </w:p>
+        </w:tc>
+        <w:tc>
+          <w:tcPr>
+            <w:tcBorders>
+              <w:top w:val="single" w:color="CBD5E1" w:sz="1"/>
+              <w:left w:val="single" w:color="CBD5E1" w:sz="1"/>
+              <w:bottom w:val="single" w:color="CBD5E1" w:sz="1"/>
+              <w:right w:val="single" w:color="CBD5E1" w:sz="1"/>
+            </w:tcBorders>
+            <w:tcMar>
+              <w:top w:type="dxa" w:w="80"/>
+              <w:left w:type="dxa" w:w="120"/>
+              <w:bottom w:type="dxa" w:w="80"/>
+              <w:right w:type="dxa" w:w="120"/>
+            </w:tcMar>
+          </w:tcPr>
+          <w:p>
+            <w:r>
+              <w:rPr>
+                <w:rFonts w:ascii="Calibri" w:cs="Calibri" w:eastAsia="Calibri" w:hAnsi="Calibri"/>
+                <w:sz w:val="19"/>
+                <w:szCs w:val="19"/>
+              </w:rPr>
+              <w:t xml:space="preserve">MongoDB (Mongoose ODM with 2dsphere indexing &amp; exponential connection retry loop), Local Upload Storage with auto-initialization</w:t>
             </w:r>
           </w:p>
         </w:tc>
@@ -1404,55 +1185,161 @@
               <w:bottom w:val="single" w:color="CBD5E1" w:sz="1"/>
               <w:right w:val="single" w:color="CBD5E1" w:sz="1"/>
             </w:tcBorders>
-            <w:shd w:fill="CCFBF1" w:val="clear"/>
-            <w:tcMar>
-              <w:top w:type="dxa" w:w="110"/>
-              <w:left w:type="dxa" w:w="140"/>
-              <w:bottom w:type="dxa" w:w="110"/>
-              <w:right w:type="dxa" w:w="140"/>
-            </w:tcMar>
-          </w:tcPr>
-          <w:p>
-            <w:r>
-              <w:rPr>
-                <w:rFonts w:ascii="Calibri" w:cs="Calibri" w:eastAsia="Calibri" w:hAnsi="Calibri"/>
-                <w:b/>
-                <w:bCs/>
-                <w:color w:val="0F766E"/>
-                <w:sz w:val="20"/>
-                <w:szCs w:val="20"/>
-              </w:rPr>
-              <w:t xml:space="preserve">TOTAL PROJECTED ANNUAL FISCAL SAVINGS</w:t>
-            </w:r>
-          </w:p>
-        </w:tc>
-        <w:tc>
-          <w:tcPr>
-            <w:tcBorders>
-              <w:top w:val="single" w:color="CBD5E1" w:sz="1"/>
-              <w:left w:val="single" w:color="CBD5E1" w:sz="1"/>
-              <w:bottom w:val="single" w:color="CBD5E1" w:sz="1"/>
-              <w:right w:val="single" w:color="CBD5E1" w:sz="1"/>
-            </w:tcBorders>
-            <w:shd w:fill="CCFBF1" w:val="clear"/>
-            <w:tcMar>
-              <w:top w:type="dxa" w:w="110"/>
-              <w:left w:type="dxa" w:w="140"/>
-              <w:bottom w:type="dxa" w:w="110"/>
-              <w:right w:type="dxa" w:w="140"/>
-            </w:tcMar>
-          </w:tcPr>
-          <w:p>
-            <w:r>
-              <w:rPr>
-                <w:rFonts w:ascii="Calibri" w:cs="Calibri" w:eastAsia="Calibri" w:hAnsi="Calibri"/>
-                <w:b/>
-                <w:bCs/>
-                <w:color w:val="0F766E"/>
-                <w:sz w:val="20"/>
-                <w:szCs w:val="20"/>
-              </w:rPr>
-              <w:t xml:space="preserve">₹ 39.80 Crore</w:t>
+            <w:tcMar>
+              <w:top w:type="dxa" w:w="80"/>
+              <w:left w:type="dxa" w:w="120"/>
+              <w:bottom w:type="dxa" w:w="80"/>
+              <w:right w:type="dxa" w:w="120"/>
+            </w:tcMar>
+          </w:tcPr>
+          <w:p>
+            <w:r>
+              <w:rPr>
+                <w:rFonts w:ascii="Calibri" w:cs="Calibri" w:eastAsia="Calibri" w:hAnsi="Calibri"/>
+                <w:b/>
+                <w:bCs/>
+                <w:sz w:val="19"/>
+                <w:szCs w:val="19"/>
+              </w:rPr>
+              <w:t xml:space="preserve">AI &amp; Vision Pipeline</w:t>
+            </w:r>
+          </w:p>
+        </w:tc>
+        <w:tc>
+          <w:tcPr>
+            <w:tcBorders>
+              <w:top w:val="single" w:color="CBD5E1" w:sz="1"/>
+              <w:left w:val="single" w:color="CBD5E1" w:sz="1"/>
+              <w:bottom w:val="single" w:color="CBD5E1" w:sz="1"/>
+              <w:right w:val="single" w:color="CBD5E1" w:sz="1"/>
+            </w:tcBorders>
+            <w:tcMar>
+              <w:top w:type="dxa" w:w="80"/>
+              <w:left w:type="dxa" w:w="120"/>
+              <w:bottom w:type="dxa" w:w="80"/>
+              <w:right w:type="dxa" w:w="120"/>
+            </w:tcMar>
+          </w:tcPr>
+          <w:p>
+            <w:r>
+              <w:rPr>
+                <w:rFonts w:ascii="Calibri" w:cs="Calibri" w:eastAsia="Calibri" w:hAnsi="Calibri"/>
+                <w:sz w:val="19"/>
+                <w:szCs w:val="19"/>
+              </w:rPr>
+              <w:t xml:space="preserve">YOLOv8 + NVIDIA NIM / TensorRT, Sharp pixel variance inspection, and Gemini AI analysis</w:t>
+            </w:r>
+          </w:p>
+        </w:tc>
+      </w:tr>
+      <w:tr>
+        <w:tc>
+          <w:tcPr>
+            <w:tcBorders>
+              <w:top w:val="single" w:color="CBD5E1" w:sz="1"/>
+              <w:left w:val="single" w:color="CBD5E1" w:sz="1"/>
+              <w:bottom w:val="single" w:color="CBD5E1" w:sz="1"/>
+              <w:right w:val="single" w:color="CBD5E1" w:sz="1"/>
+            </w:tcBorders>
+            <w:tcMar>
+              <w:top w:type="dxa" w:w="80"/>
+              <w:left w:type="dxa" w:w="120"/>
+              <w:bottom w:type="dxa" w:w="80"/>
+              <w:right w:type="dxa" w:w="120"/>
+            </w:tcMar>
+          </w:tcPr>
+          <w:p>
+            <w:r>
+              <w:rPr>
+                <w:rFonts w:ascii="Calibri" w:cs="Calibri" w:eastAsia="Calibri" w:hAnsi="Calibri"/>
+                <w:b/>
+                <w:bCs/>
+                <w:sz w:val="19"/>
+                <w:szCs w:val="19"/>
+              </w:rPr>
+              <w:t xml:space="preserve">GIS &amp; Mapping</w:t>
+            </w:r>
+          </w:p>
+        </w:tc>
+        <w:tc>
+          <w:tcPr>
+            <w:tcBorders>
+              <w:top w:val="single" w:color="CBD5E1" w:sz="1"/>
+              <w:left w:val="single" w:color="CBD5E1" w:sz="1"/>
+              <w:bottom w:val="single" w:color="CBD5E1" w:sz="1"/>
+              <w:right w:val="single" w:color="CBD5E1" w:sz="1"/>
+            </w:tcBorders>
+            <w:tcMar>
+              <w:top w:type="dxa" w:w="80"/>
+              <w:left w:type="dxa" w:w="120"/>
+              <w:bottom w:type="dxa" w:w="80"/>
+              <w:right w:type="dxa" w:w="120"/>
+            </w:tcMar>
+          </w:tcPr>
+          <w:p>
+            <w:r>
+              <w:rPr>
+                <w:rFonts w:ascii="Calibri" w:cs="Calibri" w:eastAsia="Calibri" w:hAnsi="Calibri"/>
+                <w:sz w:val="19"/>
+                <w:szCs w:val="19"/>
+              </w:rPr>
+              <w:t xml:space="preserve">Leaflet, MarkerCluster, OpenStreetMap Tiles, Mumbai 24-Ward Polygon GeoJSON</w:t>
+            </w:r>
+          </w:p>
+        </w:tc>
+      </w:tr>
+      <w:tr>
+        <w:tc>
+          <w:tcPr>
+            <w:tcBorders>
+              <w:top w:val="single" w:color="CBD5E1" w:sz="1"/>
+              <w:left w:val="single" w:color="CBD5E1" w:sz="1"/>
+              <w:bottom w:val="single" w:color="CBD5E1" w:sz="1"/>
+              <w:right w:val="single" w:color="CBD5E1" w:sz="1"/>
+            </w:tcBorders>
+            <w:tcMar>
+              <w:top w:type="dxa" w:w="80"/>
+              <w:left w:type="dxa" w:w="120"/>
+              <w:bottom w:type="dxa" w:w="80"/>
+              <w:right w:type="dxa" w:w="120"/>
+            </w:tcMar>
+          </w:tcPr>
+          <w:p>
+            <w:r>
+              <w:rPr>
+                <w:rFonts w:ascii="Calibri" w:cs="Calibri" w:eastAsia="Calibri" w:hAnsi="Calibri"/>
+                <w:b/>
+                <w:bCs/>
+                <w:sz w:val="19"/>
+                <w:szCs w:val="19"/>
+              </w:rPr>
+              <w:t xml:space="preserve">Authentication &amp; Push</w:t>
+            </w:r>
+          </w:p>
+        </w:tc>
+        <w:tc>
+          <w:tcPr>
+            <w:tcBorders>
+              <w:top w:val="single" w:color="CBD5E1" w:sz="1"/>
+              <w:left w:val="single" w:color="CBD5E1" w:sz="1"/>
+              <w:bottom w:val="single" w:color="CBD5E1" w:sz="1"/>
+              <w:right w:val="single" w:color="CBD5E1" w:sz="1"/>
+            </w:tcBorders>
+            <w:tcMar>
+              <w:top w:type="dxa" w:w="80"/>
+              <w:left w:type="dxa" w:w="120"/>
+              <w:bottom w:type="dxa" w:w="80"/>
+              <w:right w:type="dxa" w:w="120"/>
+            </w:tcMar>
+          </w:tcPr>
+          <w:p>
+            <w:r>
+              <w:rPr>
+                <w:rFonts w:ascii="Calibri" w:cs="Calibri" w:eastAsia="Calibri" w:hAnsi="Calibri"/>
+                <w:sz w:val="19"/>
+                <w:szCs w:val="19"/>
+              </w:rPr>
+              <w:t xml:space="preserve">JWT Bearer Authentication, Firebase Auth &amp; Firebase Cloud Messaging (FCM)</w:t>
             </w:r>
           </w:p>
         </w:tc>
@@ -1471,7 +1358,7 @@
           <w:sz w:val="26"/>
           <w:szCs w:val="26"/>
         </w:rPr>
-        <w:t xml:space="preserve">7. 30-Day Zero-Risk Pilot &amp; Call to Action</w:t>
+        <w:t xml:space="preserve">5. Proposed Pilot Deployment &amp; Demonstration Access</w:t>
       </w:r>
     </w:p>
     <w:p>
@@ -1485,7 +1372,7 @@
           <w:sz w:val="20"/>
           <w:szCs w:val="20"/>
         </w:rPr>
-        <w:t xml:space="preserve">We propose an immediate 30-day zero-cost trial across Ward K-West (Andheri West) and Ward G-North (Dadar / Dharavi) to validate sub-30-second AI triage, 0% false closures, and sub-24h resolution times.</w:t>
+        <w:t xml:space="preserve">An immediate 30-day zero-risk trial is recommended across high-density pilot wards: Ward G-North (Dadar / Dharavi) and Ward H-West (Bandra / Khar), validating sub-30-second automated triage, 0% duplicate ticket leaks, and real-time field task claiming.</w:t>
       </w:r>
     </w:p>
     <w:tbl>
@@ -1530,7 +1417,7 @@
                 <w:sz w:val="20"/>
                 <w:szCs w:val="20"/>
               </w:rPr>
-              <w:t xml:space="preserve">OFFICIAL SYSTEM DEMO &amp; EXECUTIVE BRIEFING
+              <w:t xml:space="preserve">OFFICIAL SYSTEM DEMONSTRATION ACCESS
 </w:t>
             </w:r>
             <w:r>
@@ -1542,7 +1429,7 @@
                 <w:sz w:val="19"/>
                 <w:szCs w:val="19"/>
               </w:rPr>
-              <w:t xml:space="preserve">Live Production Link: </w:t>
+              <w:t xml:space="preserve">Live Web App: </w:t>
             </w:r>
             <w:r>
               <w:rPr>
@@ -1561,7 +1448,7 @@
                 <w:sz w:val="18"/>
                 <w:szCs w:val="18"/>
               </w:rPr>
-              <w:t xml:space="preserve">Demo Accounts: admin@smartcivic.gov.in | engineer@kwest.bmc.gov.in | contractor@mumbai-roads.com
+              <w:t xml:space="preserve">Municipal Architecture Liaison: Municipal Solutions Architecture Group, Fort HQ, Mumbai - 400001
 </w:t>
             </w:r>
             <w:r>
@@ -1571,17 +1458,7 @@
                 <w:sz w:val="18"/>
                 <w:szCs w:val="18"/>
               </w:rPr>
-              <w:t xml:space="preserve">Secretariat Liaison: Municipal Solutions Architecture Group, Fort HQ, Mumbai - 400001
-</w:t>
-            </w:r>
-            <w:r>
-              <w:rPr>
-                <w:rFonts w:ascii="Calibri" w:cs="Calibri" w:eastAsia="Calibri" w:hAnsi="Calibri"/>
-                <w:color w:val="475569"/>
-                <w:sz w:val="18"/>
-                <w:szCs w:val="18"/>
-              </w:rPr>
-              <w:t xml:space="preserve">Direct Line: +91 22 2262 0251 / Extension 4019</w:t>
+              <w:t xml:space="preserve">Direct Reference: BMC/IT-CIVIC/2026/PROPOSAL-0419</w:t>
             </w:r>
           </w:p>
         </w:tc>

</xml_diff>